<commit_message>
docs: expand Lab02 report with diagrams and explanations
</commit_message>
<xml_diff>
--- a/Lab02/BaoCao_Lab02_NguyenHuynhPhuongDong_3124411071.docx
+++ b/Lab02/BaoCao_Lab02_NguyenHuynhPhuongDong_3124411071.docx
@@ -53,7 +53,7 @@
                     <pic:cNvPicPr/>
                   </pic:nvPicPr>
                   <pic:blipFill>
-                    <a:blip r:embed="rId9"/>
+                    <a:blip r:embed="rId10"/>
                     <a:stretch>
                       <a:fillRect/>
                     </a:stretch>
@@ -211,23 +211,10 @@
     </w:tbl>
     <w:p>
       <w:pPr>
-        <w:spacing w:before="1200"/>
-        <w:jc w:val="center"/>
-      </w:pPr>
-      <w:r>
-        <w:rPr>
-          <w:rFonts w:ascii="Times New Roman" w:hAnsi="Times New Roman" w:eastAsia="Times New Roman"/>
-          <w:color w:val="000000"/>
-          <w:sz w:val="24"/>
-        </w:rPr>
-        <w:t>Thành phố Hồ Chí Minh, năm 2026</w:t>
-      </w:r>
-    </w:p>
-    <w:p>
-      <w:pPr>
         <w:sectPr>
+          <w:footerReference w:type="default" r:id="rId9"/>
           <w:pgSz w:w="11906" w:h="16838"/>
-          <w:pgMar w:top="794" w:right="1020" w:bottom="794" w:left="1020" w:header="720" w:footer="720" w:gutter="0"/>
+          <w:pgMar w:top="794" w:right="1020" w:bottom="794" w:left="1020" w:header="720" w:footer="397" w:gutter="0"/>
           <w:cols w:space="720"/>
           <w:docGrid w:linePitch="360"/>
           <w:pgBorders w:offsetFrom="page">
@@ -2280,7 +2267,7 @@
         <w:rPr>
           <w:b/>
         </w:rPr>
-        <w:t>Yêu cầu và cách làm</w:t>
+        <w:t>Yêu cầu và hướng xử lý</w:t>
       </w:r>
     </w:p>
     <w:p>
@@ -2570,6 +2557,94 @@
       </w:pPr>
     </w:p>
     <w:p>
+      <w:pPr>
+        <w:keepNext/>
+        <w:pageBreakBefore/>
+        <w:spacing w:before="140" w:after="80"/>
+      </w:pPr>
+      <w:r>
+        <w:rPr>
+          <w:b/>
+        </w:rPr>
+        <w:t>Sơ đồ lớp</w:t>
+      </w:r>
+    </w:p>
+    <w:p>
+      <w:pPr>
+        <w:spacing w:after="60"/>
+        <w:jc w:val="center"/>
+      </w:pPr>
+      <w:r>
+        <w:drawing>
+          <wp:inline xmlns:a="http://schemas.openxmlformats.org/drawingml/2006/main" xmlns:pic="http://schemas.openxmlformats.org/drawingml/2006/picture">
+            <wp:extent cx="2321000" cy="3960000"/>
+            <wp:docPr id="2" name="Picture 2"/>
+            <wp:cNvGraphicFramePr>
+              <a:graphicFrameLocks noChangeAspect="1"/>
+            </wp:cNvGraphicFramePr>
+            <a:graphic>
+              <a:graphicData uri="http://schemas.openxmlformats.org/drawingml/2006/picture">
+                <pic:pic>
+                  <pic:nvPicPr>
+                    <pic:cNvPr id="0" name="Bai01_01_TuoiSinhVien.png"/>
+                    <pic:cNvPicPr/>
+                  </pic:nvPicPr>
+                  <pic:blipFill>
+                    <a:blip r:embed="rId13"/>
+                    <a:stretch>
+                      <a:fillRect/>
+                    </a:stretch>
+                  </pic:blipFill>
+                  <pic:spPr>
+                    <a:xfrm>
+                      <a:off x="0" y="0"/>
+                      <a:ext cx="2321000" cy="3960000"/>
+                    </a:xfrm>
+                    <a:prstGeom prst="rect"/>
+                  </pic:spPr>
+                </pic:pic>
+              </a:graphicData>
+            </a:graphic>
+          </wp:inline>
+        </w:drawing>
+      </w:r>
+    </w:p>
+    <w:p>
+      <w:pPr>
+        <w:spacing w:after="120"/>
+        <w:jc w:val="center"/>
+      </w:pPr>
+      <w:r>
+        <w:rPr>
+          <w:i/>
+          <w:sz w:val="18"/>
+        </w:rPr>
+        <w:t>Sơ đồ lớp tham khảo dùng để đối chiếu cấu trúc và quan hệ giữa các lớp.</w:t>
+      </w:r>
+    </w:p>
+    <w:p>
+      <w:pPr>
+        <w:keepNext/>
+        <w:spacing w:before="140" w:after="80"/>
+      </w:pPr>
+      <w:r>
+        <w:rPr>
+          <w:b/>
+        </w:rPr>
+        <w:t>Giải thích bài làm</w:t>
+      </w:r>
+    </w:p>
+    <w:p>
+      <w:r>
+        <w:t>Lớp SinhVien đóng gói hai dữ liệu là họ tên và năm sinh. Các property kiểm tra họ tên không rỗng và năm sinh không vượt quá năm hiện tại; nhờ đó đối tượng luôn ở trạng thái hợp lệ sau khi được tạo hoặc nhập lại.</w:t>
+      </w:r>
+    </w:p>
+    <w:p>
+      <w:r>
+        <w:t>Phương thức TinhTuoi lấy năm hiện tại trừ năm sinh vì đề chỉ cung cấp năm, không cung cấp ngày tháng. Program tạo đối tượng, gọi Input để nhận dữ liệu đã kiểm tra rồi gọi Output; constructor sao chép được dùng để chứng minh hai đối tượng có dữ liệu giống nhau nhưng độc lập.</w:t>
+      </w:r>
+    </w:p>
+    <w:p>
       <w:r>
         <w:rPr>
           <w:sz w:val="18"/>
@@ -2596,7 +2671,7 @@
         <w:rPr>
           <w:b/>
         </w:rPr>
-        <w:t>Yêu cầu và cách làm</w:t>
+        <w:t>Yêu cầu và hướng xử lý</w:t>
       </w:r>
     </w:p>
     <w:p>
@@ -2956,6 +3031,94 @@
       </w:pPr>
     </w:p>
     <w:p>
+      <w:pPr>
+        <w:keepNext/>
+        <w:pageBreakBefore/>
+        <w:spacing w:before="140" w:after="80"/>
+      </w:pPr>
+      <w:r>
+        <w:rPr>
+          <w:b/>
+        </w:rPr>
+        <w:t>Sơ đồ lớp</w:t>
+      </w:r>
+    </w:p>
+    <w:p>
+      <w:pPr>
+        <w:spacing w:after="60"/>
+        <w:jc w:val="center"/>
+      </w:pPr>
+      <w:r>
+        <w:drawing>
+          <wp:inline xmlns:a="http://schemas.openxmlformats.org/drawingml/2006/main" xmlns:pic="http://schemas.openxmlformats.org/drawingml/2006/picture">
+            <wp:extent cx="2144504" cy="3960000"/>
+            <wp:docPr id="3" name="Picture 3"/>
+            <wp:cNvGraphicFramePr>
+              <a:graphicFrameLocks noChangeAspect="1"/>
+            </wp:cNvGraphicFramePr>
+            <a:graphic>
+              <a:graphicData uri="http://schemas.openxmlformats.org/drawingml/2006/picture">
+                <pic:pic>
+                  <pic:nvPicPr>
+                    <pic:cNvPr id="0" name="Bai01_02_Point.png"/>
+                    <pic:cNvPicPr/>
+                  </pic:nvPicPr>
+                  <pic:blipFill>
+                    <a:blip r:embed="rId14"/>
+                    <a:stretch>
+                      <a:fillRect/>
+                    </a:stretch>
+                  </pic:blipFill>
+                  <pic:spPr>
+                    <a:xfrm>
+                      <a:off x="0" y="0"/>
+                      <a:ext cx="2144504" cy="3960000"/>
+                    </a:xfrm>
+                    <a:prstGeom prst="rect"/>
+                  </pic:spPr>
+                </pic:pic>
+              </a:graphicData>
+            </a:graphic>
+          </wp:inline>
+        </w:drawing>
+      </w:r>
+    </w:p>
+    <w:p>
+      <w:pPr>
+        <w:spacing w:after="120"/>
+        <w:jc w:val="center"/>
+      </w:pPr>
+      <w:r>
+        <w:rPr>
+          <w:i/>
+          <w:sz w:val="18"/>
+        </w:rPr>
+        <w:t>Sơ đồ lớp tham khảo dùng để đối chiếu cấu trúc và quan hệ giữa các lớp.</w:t>
+      </w:r>
+    </w:p>
+    <w:p>
+      <w:pPr>
+        <w:keepNext/>
+        <w:spacing w:before="140" w:after="80"/>
+      </w:pPr>
+      <w:r>
+        <w:rPr>
+          <w:b/>
+        </w:rPr>
+        <w:t>Giải thích bài làm</w:t>
+      </w:r>
+    </w:p>
+    <w:p>
+      <w:r>
+        <w:t>Lớp Point lưu hoành độ và tung độ qua hai property X, Y, đồng thời cung cấp constructor mặc định, constructor có tham số và constructor sao chép. Các toán tử cộng, trừ và đổi dấu đều trả về một Point mới nên không làm thay đổi hai toán hạng ban đầu.</w:t>
+      </w:r>
+    </w:p>
+    <w:p>
+      <w:r>
+        <w:t>Khoảng cách được tính bằng căn bậc hai của tổng bình phương độ lệch hai tọa độ; trung điểm là trung bình cộng từng tọa độ. Bài cài đặt cả phương thức thành viên và phương thức tĩnh để minh họa hai cách gọi cho cùng một phép toán hình học.</w:t>
+      </w:r>
+    </w:p>
+    <w:p>
       <w:r>
         <w:rPr>
           <w:sz w:val="18"/>
@@ -2982,7 +3145,7 @@
         <w:rPr>
           <w:b/>
         </w:rPr>
-        <w:t>Yêu cầu và cách làm</w:t>
+        <w:t>Yêu cầu và hướng xử lý</w:t>
       </w:r>
     </w:p>
     <w:p>
@@ -3356,6 +3519,94 @@
       </w:pPr>
     </w:p>
     <w:p>
+      <w:pPr>
+        <w:keepNext/>
+        <w:pageBreakBefore/>
+        <w:spacing w:before="140" w:after="80"/>
+      </w:pPr>
+      <w:r>
+        <w:rPr>
+          <w:b/>
+        </w:rPr>
+        <w:t>Sơ đồ lớp</w:t>
+      </w:r>
+    </w:p>
+    <w:p>
+      <w:pPr>
+        <w:spacing w:after="60"/>
+        <w:jc w:val="center"/>
+      </w:pPr>
+      <w:r>
+        <w:drawing>
+          <wp:inline xmlns:a="http://schemas.openxmlformats.org/drawingml/2006/main" xmlns:pic="http://schemas.openxmlformats.org/drawingml/2006/picture">
+            <wp:extent cx="3066893" cy="3960000"/>
+            <wp:docPr id="4" name="Picture 4"/>
+            <wp:cNvGraphicFramePr>
+              <a:graphicFrameLocks noChangeAspect="1"/>
+            </wp:cNvGraphicFramePr>
+            <a:graphic>
+              <a:graphicData uri="http://schemas.openxmlformats.org/drawingml/2006/picture">
+                <pic:pic>
+                  <pic:nvPicPr>
+                    <pic:cNvPr id="0" name="Bai01_03_Person.png"/>
+                    <pic:cNvPicPr/>
+                  </pic:nvPicPr>
+                  <pic:blipFill>
+                    <a:blip r:embed="rId15"/>
+                    <a:stretch>
+                      <a:fillRect/>
+                    </a:stretch>
+                  </pic:blipFill>
+                  <pic:spPr>
+                    <a:xfrm>
+                      <a:off x="0" y="0"/>
+                      <a:ext cx="3066893" cy="3960000"/>
+                    </a:xfrm>
+                    <a:prstGeom prst="rect"/>
+                  </pic:spPr>
+                </pic:pic>
+              </a:graphicData>
+            </a:graphic>
+          </wp:inline>
+        </w:drawing>
+      </w:r>
+    </w:p>
+    <w:p>
+      <w:pPr>
+        <w:spacing w:after="120"/>
+        <w:jc w:val="center"/>
+      </w:pPr>
+      <w:r>
+        <w:rPr>
+          <w:i/>
+          <w:sz w:val="18"/>
+        </w:rPr>
+        <w:t>Sơ đồ lớp tham khảo dùng để đối chiếu cấu trúc và quan hệ giữa các lớp.</w:t>
+      </w:r>
+    </w:p>
+    <w:p>
+      <w:pPr>
+        <w:keepNext/>
+        <w:spacing w:before="140" w:after="80"/>
+      </w:pPr>
+      <w:r>
+        <w:rPr>
+          <w:b/>
+        </w:rPr>
+        <w:t>Giải thích bài làm</w:t>
+      </w:r>
+    </w:p>
+    <w:p>
+      <w:r>
+        <w:t>Person quản lý mã định danh, họ tên, năm sinh và năm mất. Property kiểm tra mã và tên không rỗng, năm sinh hợp lệ, đồng thời chỉ chấp nhận năm mất bằng 0 hoặc không nhỏ hơn năm sinh.</w:t>
+      </w:r>
+    </w:p>
+    <w:p>
+      <w:r>
+        <w:t>Quy ước Yod bằng 0 biểu diễn người còn sống, vì vậy IsLiving chỉ cần kiểm tra điều kiện này. Các constructor hỗ trợ khởi tạo mặc định, khởi tạo đầy đủ và sao chép; Input và Output chịu trách nhiệm giao tiếp, còn quy tắc nghiệp vụ nằm trong lớp Person.</w:t>
+      </w:r>
+    </w:p>
+    <w:p>
       <w:r>
         <w:rPr>
           <w:sz w:val="18"/>
@@ -3382,7 +3633,7 @@
         <w:rPr>
           <w:b/>
         </w:rPr>
-        <w:t>Yêu cầu và cách làm</w:t>
+        <w:t>Yêu cầu và hướng xử lý</w:t>
       </w:r>
     </w:p>
     <w:p>
@@ -3910,6 +4161,94 @@
       </w:pPr>
     </w:p>
     <w:p>
+      <w:pPr>
+        <w:keepNext/>
+        <w:pageBreakBefore/>
+        <w:spacing w:before="140" w:after="80"/>
+      </w:pPr>
+      <w:r>
+        <w:rPr>
+          <w:b/>
+        </w:rPr>
+        <w:t>Sơ đồ lớp</w:t>
+      </w:r>
+    </w:p>
+    <w:p>
+      <w:pPr>
+        <w:spacing w:after="60"/>
+        <w:jc w:val="center"/>
+      </w:pPr>
+      <w:r>
+        <w:drawing>
+          <wp:inline xmlns:a="http://schemas.openxmlformats.org/drawingml/2006/main" xmlns:pic="http://schemas.openxmlformats.org/drawingml/2006/picture">
+            <wp:extent cx="1781674" cy="3960000"/>
+            <wp:docPr id="5" name="Picture 5"/>
+            <wp:cNvGraphicFramePr>
+              <a:graphicFrameLocks noChangeAspect="1"/>
+            </wp:cNvGraphicFramePr>
+            <a:graphic>
+              <a:graphicData uri="http://schemas.openxmlformats.org/drawingml/2006/picture">
+                <pic:pic>
+                  <pic:nvPicPr>
+                    <pic:cNvPr id="0" name="Bai01_04_PhanSo.png"/>
+                    <pic:cNvPicPr/>
+                  </pic:nvPicPr>
+                  <pic:blipFill>
+                    <a:blip r:embed="rId16"/>
+                    <a:stretch>
+                      <a:fillRect/>
+                    </a:stretch>
+                  </pic:blipFill>
+                  <pic:spPr>
+                    <a:xfrm>
+                      <a:off x="0" y="0"/>
+                      <a:ext cx="1781674" cy="3960000"/>
+                    </a:xfrm>
+                    <a:prstGeom prst="rect"/>
+                  </pic:spPr>
+                </pic:pic>
+              </a:graphicData>
+            </a:graphic>
+          </wp:inline>
+        </w:drawing>
+      </w:r>
+    </w:p>
+    <w:p>
+      <w:pPr>
+        <w:spacing w:after="120"/>
+        <w:jc w:val="center"/>
+      </w:pPr>
+      <w:r>
+        <w:rPr>
+          <w:i/>
+          <w:sz w:val="18"/>
+        </w:rPr>
+        <w:t>Sơ đồ lớp tham khảo dùng để đối chiếu cấu trúc và quan hệ giữa các lớp.</w:t>
+      </w:r>
+    </w:p>
+    <w:p>
+      <w:pPr>
+        <w:keepNext/>
+        <w:spacing w:before="140" w:after="80"/>
+      </w:pPr>
+      <w:r>
+        <w:rPr>
+          <w:b/>
+        </w:rPr>
+        <w:t>Giải thích bài làm</w:t>
+      </w:r>
+    </w:p>
+    <w:p>
+      <w:r>
+        <w:t>PhanSo chuẩn hóa ngay trong constructor: mẫu số khác 0, dấu âm được chuyển lên tử và tử mẫu được chia cho ước chung lớn nhất. Nhờ mọi phân số đều ở dạng chuẩn, ToString, Equals và GetHashCode cho kết quả nhất quán.</w:t>
+      </w:r>
+    </w:p>
+    <w:p>
+      <w:r>
+        <w:t>Các toán tử số học tạo phân số mới rồi tự rút gọn; phép chia kiểm tra phân số chia khác 0. So sánh dùng phép nhân chéo bằng BigInteger để hạn chế tràn số khi tử hoặc mẫu lớn, sau đó các toán tử quan hệ và bằng nhau dùng chung kết quả so sánh đó.</w:t>
+      </w:r>
+    </w:p>
+    <w:p>
       <w:r>
         <w:rPr>
           <w:sz w:val="18"/>
@@ -3936,7 +4275,7 @@
         <w:rPr>
           <w:b/>
         </w:rPr>
-        <w:t>Yêu cầu và cách làm</w:t>
+        <w:t>Yêu cầu và hướng xử lý</w:t>
       </w:r>
     </w:p>
     <w:p>
@@ -4184,6 +4523,94 @@
       </w:pPr>
     </w:p>
     <w:p>
+      <w:pPr>
+        <w:keepNext/>
+        <w:pageBreakBefore/>
+        <w:spacing w:before="140" w:after="80"/>
+      </w:pPr>
+      <w:r>
+        <w:rPr>
+          <w:b/>
+        </w:rPr>
+        <w:t>Sơ đồ lớp</w:t>
+      </w:r>
+    </w:p>
+    <w:p>
+      <w:pPr>
+        <w:spacing w:after="60"/>
+        <w:jc w:val="center"/>
+      </w:pPr>
+      <w:r>
+        <w:drawing>
+          <wp:inline xmlns:a="http://schemas.openxmlformats.org/drawingml/2006/main" xmlns:pic="http://schemas.openxmlformats.org/drawingml/2006/picture">
+            <wp:extent cx="4126299" cy="3960000"/>
+            <wp:docPr id="6" name="Picture 6"/>
+            <wp:cNvGraphicFramePr>
+              <a:graphicFrameLocks noChangeAspect="1"/>
+            </wp:cNvGraphicFramePr>
+            <a:graphic>
+              <a:graphicData uri="http://schemas.openxmlformats.org/drawingml/2006/picture">
+                <pic:pic>
+                  <pic:nvPicPr>
+                    <pic:cNvPr id="0" name="Bai01_05_DonThuc.png"/>
+                    <pic:cNvPicPr/>
+                  </pic:nvPicPr>
+                  <pic:blipFill>
+                    <a:blip r:embed="rId17"/>
+                    <a:stretch>
+                      <a:fillRect/>
+                    </a:stretch>
+                  </pic:blipFill>
+                  <pic:spPr>
+                    <a:xfrm>
+                      <a:off x="0" y="0"/>
+                      <a:ext cx="4126299" cy="3960000"/>
+                    </a:xfrm>
+                    <a:prstGeom prst="rect"/>
+                  </pic:spPr>
+                </pic:pic>
+              </a:graphicData>
+            </a:graphic>
+          </wp:inline>
+        </w:drawing>
+      </w:r>
+    </w:p>
+    <w:p>
+      <w:pPr>
+        <w:spacing w:after="120"/>
+        <w:jc w:val="center"/>
+      </w:pPr>
+      <w:r>
+        <w:rPr>
+          <w:i/>
+          <w:sz w:val="18"/>
+        </w:rPr>
+        <w:t>Sơ đồ lớp tham khảo dùng để đối chiếu cấu trúc và quan hệ giữa các lớp.</w:t>
+      </w:r>
+    </w:p>
+    <w:p>
+      <w:pPr>
+        <w:keepNext/>
+        <w:spacing w:before="140" w:after="80"/>
+      </w:pPr>
+      <w:r>
+        <w:rPr>
+          <w:b/>
+        </w:rPr>
+        <w:t>Giải thích bài làm</w:t>
+      </w:r>
+    </w:p>
+    <w:p>
+      <w:r>
+        <w:t>DonThuc biểu diễn biểu thức a nhân x mũ n bằng hệ số HeSo và số mũ SoMu. Số mũ được giới hạn không âm theo dạng đơn thức trong đề; Tinh dùng Math.Pow để tính giá trị tại x.</w:t>
+      </w:r>
+    </w:p>
+    <w:p>
+      <w:r>
+        <w:t>DaoHam áp dụng công thức (a.x^n)' = a.n.x^(n-1). Với n bằng 0, đạo hàm là đơn thức 0 và số mũ được giữ ở 0 để không tạo trạng thái không hợp lệ. Program in cả đơn thức, giá trị tại x và đạo hàm để đối chiếu.</w:t>
+      </w:r>
+    </w:p>
+    <w:p>
       <w:r>
         <w:rPr>
           <w:sz w:val="18"/>
@@ -4210,7 +4637,7 @@
         <w:rPr>
           <w:b/>
         </w:rPr>
-        <w:t>Yêu cầu và cách làm</w:t>
+        <w:t>Yêu cầu và hướng xử lý</w:t>
       </w:r>
     </w:p>
     <w:p>
@@ -4696,6 +5123,94 @@
       </w:pPr>
     </w:p>
     <w:p>
+      <w:pPr>
+        <w:keepNext/>
+        <w:pageBreakBefore/>
+        <w:spacing w:before="140" w:after="80"/>
+      </w:pPr>
+      <w:r>
+        <w:rPr>
+          <w:b/>
+        </w:rPr>
+        <w:t>Sơ đồ lớp</w:t>
+      </w:r>
+    </w:p>
+    <w:p>
+      <w:pPr>
+        <w:spacing w:after="60"/>
+        <w:jc w:val="center"/>
+      </w:pPr>
+      <w:r>
+        <w:drawing>
+          <wp:inline xmlns:a="http://schemas.openxmlformats.org/drawingml/2006/main" xmlns:pic="http://schemas.openxmlformats.org/drawingml/2006/picture">
+            <wp:extent cx="3570115" cy="3960000"/>
+            <wp:docPr id="7" name="Picture 7"/>
+            <wp:cNvGraphicFramePr>
+              <a:graphicFrameLocks noChangeAspect="1"/>
+            </wp:cNvGraphicFramePr>
+            <a:graphic>
+              <a:graphicData uri="http://schemas.openxmlformats.org/drawingml/2006/picture">
+                <pic:pic>
+                  <pic:nvPicPr>
+                    <pic:cNvPr id="0" name="Bai02_01_ArrayPoint.png"/>
+                    <pic:cNvPicPr/>
+                  </pic:nvPicPr>
+                  <pic:blipFill>
+                    <a:blip r:embed="rId18"/>
+                    <a:stretch>
+                      <a:fillRect/>
+                    </a:stretch>
+                  </pic:blipFill>
+                  <pic:spPr>
+                    <a:xfrm>
+                      <a:off x="0" y="0"/>
+                      <a:ext cx="3570115" cy="3960000"/>
+                    </a:xfrm>
+                    <a:prstGeom prst="rect"/>
+                  </pic:spPr>
+                </pic:pic>
+              </a:graphicData>
+            </a:graphic>
+          </wp:inline>
+        </w:drawing>
+      </w:r>
+    </w:p>
+    <w:p>
+      <w:pPr>
+        <w:spacing w:after="120"/>
+        <w:jc w:val="center"/>
+      </w:pPr>
+      <w:r>
+        <w:rPr>
+          <w:i/>
+          <w:sz w:val="18"/>
+        </w:rPr>
+        <w:t>Sơ đồ lớp tham khảo dùng để đối chiếu cấu trúc và quan hệ giữa các lớp.</w:t>
+      </w:r>
+    </w:p>
+    <w:p>
+      <w:pPr>
+        <w:keepNext/>
+        <w:spacing w:before="140" w:after="80"/>
+      </w:pPr>
+      <w:r>
+        <w:rPr>
+          <w:b/>
+        </w:rPr>
+        <w:t>Giải thích bài làm</w:t>
+      </w:r>
+    </w:p>
+    <w:p>
+      <w:r>
+        <w:t>ArrayPoint sử dụng ArrayList đúng yêu cầu đề để lưu nhiều Point. Add từ chối null, Count trả số phần tử, còn indexer cho phép truy cập theo cú pháp giống mảng và kiểm tra giới hạn chỉ số.</w:t>
+      </w:r>
+    </w:p>
+    <w:p>
+      <w:r>
+        <w:t>Khi thêm, đọc hoặc gán phần tử, chương trình tạo bản sao Point thay vì trả trực tiếp tham chiếu đang lưu. Cách sao chép phòng thủ này tránh việc mã bên ngoài vô tình sửa dữ liệu nội bộ của danh sách; Output duyệt lần lượt và hiển thị từng điểm.</w:t>
+      </w:r>
+    </w:p>
+    <w:p>
       <w:r>
         <w:rPr>
           <w:sz w:val="18"/>
@@ -4722,7 +5237,7 @@
         <w:rPr>
           <w:b/>
         </w:rPr>
-        <w:t>Yêu cầu và cách làm</w:t>
+        <w:t>Yêu cầu và hướng xử lý</w:t>
       </w:r>
     </w:p>
     <w:p>
@@ -5138,6 +5653,94 @@
       </w:pPr>
     </w:p>
     <w:p>
+      <w:pPr>
+        <w:keepNext/>
+        <w:pageBreakBefore/>
+        <w:spacing w:before="140" w:after="80"/>
+      </w:pPr>
+      <w:r>
+        <w:rPr>
+          <w:b/>
+        </w:rPr>
+        <w:t>Sơ đồ lớp</w:t>
+      </w:r>
+    </w:p>
+    <w:p>
+      <w:pPr>
+        <w:spacing w:after="60"/>
+        <w:jc w:val="center"/>
+      </w:pPr>
+      <w:r>
+        <w:drawing>
+          <wp:inline xmlns:a="http://schemas.openxmlformats.org/drawingml/2006/main" xmlns:pic="http://schemas.openxmlformats.org/drawingml/2006/picture">
+            <wp:extent cx="1259558" cy="3960000"/>
+            <wp:docPr id="8" name="Picture 8"/>
+            <wp:cNvGraphicFramePr>
+              <a:graphicFrameLocks noChangeAspect="1"/>
+            </wp:cNvGraphicFramePr>
+            <a:graphic>
+              <a:graphicData uri="http://schemas.openxmlformats.org/drawingml/2006/picture">
+                <pic:pic>
+                  <pic:nvPicPr>
+                    <pic:cNvPr id="0" name="Bai02_02_PersonList.png"/>
+                    <pic:cNvPicPr/>
+                  </pic:nvPicPr>
+                  <pic:blipFill>
+                    <a:blip r:embed="rId19"/>
+                    <a:stretch>
+                      <a:fillRect/>
+                    </a:stretch>
+                  </pic:blipFill>
+                  <pic:spPr>
+                    <a:xfrm>
+                      <a:off x="0" y="0"/>
+                      <a:ext cx="1259558" cy="3960000"/>
+                    </a:xfrm>
+                    <a:prstGeom prst="rect"/>
+                  </pic:spPr>
+                </pic:pic>
+              </a:graphicData>
+            </a:graphic>
+          </wp:inline>
+        </w:drawing>
+      </w:r>
+    </w:p>
+    <w:p>
+      <w:pPr>
+        <w:spacing w:after="120"/>
+        <w:jc w:val="center"/>
+      </w:pPr>
+      <w:r>
+        <w:rPr>
+          <w:i/>
+          <w:sz w:val="18"/>
+        </w:rPr>
+        <w:t>Sơ đồ lớp tham khảo dùng để đối chiếu cấu trúc và quan hệ giữa các lớp.</w:t>
+      </w:r>
+    </w:p>
+    <w:p>
+      <w:pPr>
+        <w:keepNext/>
+        <w:spacing w:before="140" w:after="80"/>
+      </w:pPr>
+      <w:r>
+        <w:rPr>
+          <w:b/>
+        </w:rPr>
+        <w:t>Giải thích bài làm</w:t>
+      </w:r>
+    </w:p>
+    <w:p>
+      <w:r>
+        <w:t>PersonList quản lý List&lt;Person&gt;, có phương thức Add, Input, Output và indexer. Constructor sao chép duyệt từng phần tử và gọi copy constructor của Person, tạo bản sao sâu thay vì dùng chung danh sách hoặc chung đối tượng.</w:t>
+      </w:r>
+    </w:p>
+    <w:p>
+      <w:r>
+        <w:t>LivingPeople lọc các phần tử có IsLiving bằng true và đưa bản sao của chúng vào một PersonList mới. Vì vậy danh sách kết quả có thể thay đổi độc lập với danh sách ban đầu; chương trình mẫu xuất cả toàn bộ nhân khẩu và nhóm còn sống để kiểm chứng.</w:t>
+      </w:r>
+    </w:p>
+    <w:p>
       <w:r>
         <w:rPr>
           <w:sz w:val="18"/>
@@ -5164,7 +5767,7 @@
         <w:rPr>
           <w:b/>
         </w:rPr>
-        <w:t>Yêu cầu và cách làm</w:t>
+        <w:t>Yêu cầu và hướng xử lý</w:t>
       </w:r>
     </w:p>
     <w:p>
@@ -5524,6 +6127,94 @@
       </w:pPr>
     </w:p>
     <w:p>
+      <w:pPr>
+        <w:keepNext/>
+        <w:pageBreakBefore/>
+        <w:spacing w:before="140" w:after="80"/>
+      </w:pPr>
+      <w:r>
+        <w:rPr>
+          <w:b/>
+        </w:rPr>
+        <w:t>Sơ đồ lớp</w:t>
+      </w:r>
+    </w:p>
+    <w:p>
+      <w:pPr>
+        <w:spacing w:after="60"/>
+        <w:jc w:val="center"/>
+      </w:pPr>
+      <w:r>
+        <w:drawing>
+          <wp:inline xmlns:a="http://schemas.openxmlformats.org/drawingml/2006/main" xmlns:pic="http://schemas.openxmlformats.org/drawingml/2006/picture">
+            <wp:extent cx="2806968" cy="3960000"/>
+            <wp:docPr id="9" name="Picture 9"/>
+            <wp:cNvGraphicFramePr>
+              <a:graphicFrameLocks noChangeAspect="1"/>
+            </wp:cNvGraphicFramePr>
+            <a:graphic>
+              <a:graphicData uri="http://schemas.openxmlformats.org/drawingml/2006/picture">
+                <pic:pic>
+                  <pic:nvPicPr>
+                    <pic:cNvPr id="0" name="Bai02_03_DaySo.png"/>
+                    <pic:cNvPicPr/>
+                  </pic:nvPicPr>
+                  <pic:blipFill>
+                    <a:blip r:embed="rId20"/>
+                    <a:stretch>
+                      <a:fillRect/>
+                    </a:stretch>
+                  </pic:blipFill>
+                  <pic:spPr>
+                    <a:xfrm>
+                      <a:off x="0" y="0"/>
+                      <a:ext cx="2806968" cy="3960000"/>
+                    </a:xfrm>
+                    <a:prstGeom prst="rect"/>
+                  </pic:spPr>
+                </pic:pic>
+              </a:graphicData>
+            </a:graphic>
+          </wp:inline>
+        </w:drawing>
+      </w:r>
+    </w:p>
+    <w:p>
+      <w:pPr>
+        <w:spacing w:after="120"/>
+        <w:jc w:val="center"/>
+      </w:pPr>
+      <w:r>
+        <w:rPr>
+          <w:i/>
+          <w:sz w:val="18"/>
+        </w:rPr>
+        <w:t>Sơ đồ lớp tham khảo dùng để đối chiếu cấu trúc và quan hệ giữa các lớp.</w:t>
+      </w:r>
+    </w:p>
+    <w:p>
+      <w:pPr>
+        <w:keepNext/>
+        <w:spacing w:before="140" w:after="80"/>
+      </w:pPr>
+      <w:r>
+        <w:rPr>
+          <w:b/>
+        </w:rPr>
+        <w:t>Giải thích bài làm</w:t>
+      </w:r>
+    </w:p>
+    <w:p>
+      <w:r>
+        <w:t>DaySo đóng gói mảng int và cung cấp constructor mặc định, constructor theo kích thước, constructor nhận mảng và constructor sao chép. Dữ liệu đầu vào được Clone để đối tượng không phụ thuộc vào mảng do bên ngoài truyền vào.</w:t>
+      </w:r>
+    </w:p>
+    <w:p>
+      <w:r>
+        <w:t>Indexer kiểm tra chỉ số trước khi đọc hoặc gán. Phương thức SoChan duyệt mảng, chọn phần tử có phần dư chia 2 bằng 0, bao gồm cả số âm và số 0, rồi trả về một DaySo mới chứa đúng các giá trị đã lọc.</w:t>
+      </w:r>
+    </w:p>
+    <w:p>
       <w:r>
         <w:rPr>
           <w:sz w:val="18"/>
@@ -5550,7 +6241,7 @@
         <w:rPr>
           <w:b/>
         </w:rPr>
-        <w:t>Yêu cầu và cách làm</w:t>
+        <w:t>Yêu cầu và hướng xử lý</w:t>
       </w:r>
     </w:p>
     <w:p>
@@ -5994,6 +6685,94 @@
       </w:pPr>
     </w:p>
     <w:p>
+      <w:pPr>
+        <w:keepNext/>
+        <w:pageBreakBefore/>
+        <w:spacing w:before="140" w:after="80"/>
+      </w:pPr>
+      <w:r>
+        <w:rPr>
+          <w:b/>
+        </w:rPr>
+        <w:t>Sơ đồ lớp</w:t>
+      </w:r>
+    </w:p>
+    <w:p>
+      <w:pPr>
+        <w:spacing w:after="60"/>
+        <w:jc w:val="center"/>
+      </w:pPr>
+      <w:r>
+        <w:drawing>
+          <wp:inline xmlns:a="http://schemas.openxmlformats.org/drawingml/2006/main" xmlns:pic="http://schemas.openxmlformats.org/drawingml/2006/picture">
+            <wp:extent cx="2410434" cy="3960000"/>
+            <wp:docPr id="10" name="Picture 10"/>
+            <wp:cNvGraphicFramePr>
+              <a:graphicFrameLocks noChangeAspect="1"/>
+            </wp:cNvGraphicFramePr>
+            <a:graphic>
+              <a:graphicData uri="http://schemas.openxmlformats.org/drawingml/2006/picture">
+                <pic:pic>
+                  <pic:nvPicPr>
+                    <pic:cNvPr id="0" name="Bai02_04_MaTran.png"/>
+                    <pic:cNvPicPr/>
+                  </pic:nvPicPr>
+                  <pic:blipFill>
+                    <a:blip r:embed="rId21"/>
+                    <a:stretch>
+                      <a:fillRect/>
+                    </a:stretch>
+                  </pic:blipFill>
+                  <pic:spPr>
+                    <a:xfrm>
+                      <a:off x="0" y="0"/>
+                      <a:ext cx="2410434" cy="3960000"/>
+                    </a:xfrm>
+                    <a:prstGeom prst="rect"/>
+                  </pic:spPr>
+                </pic:pic>
+              </a:graphicData>
+            </a:graphic>
+          </wp:inline>
+        </w:drawing>
+      </w:r>
+    </w:p>
+    <w:p>
+      <w:pPr>
+        <w:spacing w:after="120"/>
+        <w:jc w:val="center"/>
+      </w:pPr>
+      <w:r>
+        <w:rPr>
+          <w:i/>
+          <w:sz w:val="18"/>
+        </w:rPr>
+        <w:t>Sơ đồ lớp tham khảo dùng để đối chiếu cấu trúc và quan hệ giữa các lớp.</w:t>
+      </w:r>
+    </w:p>
+    <w:p>
+      <w:pPr>
+        <w:keepNext/>
+        <w:spacing w:before="140" w:after="80"/>
+      </w:pPr>
+      <w:r>
+        <w:rPr>
+          <w:b/>
+        </w:rPr>
+        <w:t>Giải thích bài làm</w:t>
+      </w:r>
+    </w:p>
+    <w:p>
+      <w:r>
+        <w:t>MaTran lưu dữ liệu bằng mảng int hai chiều; số dòng và số cột được lấy trực tiếp từ kích thước mảng. Constructor sao chép nhân bản toàn bộ ma trận, còn indexer hai chỉ số hỗ trợ truy cập phần tử tại vị trí hàng và cột.</w:t>
+      </w:r>
+    </w:p>
+    <w:p>
+      <w:r>
+        <w:t>LaNguyenTo loại các số nhỏ hơn 2 và chỉ thử ước từ 2 đến căn bậc hai của n, giúp giảm số phép chia. Phương thức lọc duyệt mọi ô theo thứ tự hàng, cột và trả danh sách các số nguyên tố để Program in ra kết quả.</w:t>
+      </w:r>
+    </w:p>
+    <w:p>
       <w:r>
         <w:rPr>
           <w:sz w:val="18"/>
@@ -6020,7 +6799,7 @@
         <w:rPr>
           <w:b/>
         </w:rPr>
-        <w:t>Yêu cầu và cách làm</w:t>
+        <w:t>Yêu cầu và hướng xử lý</w:t>
       </w:r>
     </w:p>
     <w:p>
@@ -6380,6 +7159,94 @@
       </w:pPr>
     </w:p>
     <w:p>
+      <w:pPr>
+        <w:keepNext/>
+        <w:pageBreakBefore/>
+        <w:spacing w:before="140" w:after="80"/>
+      </w:pPr>
+      <w:r>
+        <w:rPr>
+          <w:b/>
+        </w:rPr>
+        <w:t>Sơ đồ lớp</w:t>
+      </w:r>
+    </w:p>
+    <w:p>
+      <w:pPr>
+        <w:spacing w:after="60"/>
+        <w:jc w:val="center"/>
+      </w:pPr>
+      <w:r>
+        <w:drawing>
+          <wp:inline xmlns:a="http://schemas.openxmlformats.org/drawingml/2006/main" xmlns:pic="http://schemas.openxmlformats.org/drawingml/2006/picture">
+            <wp:extent cx="1614432" cy="3960000"/>
+            <wp:docPr id="11" name="Picture 11"/>
+            <wp:cNvGraphicFramePr>
+              <a:graphicFrameLocks noChangeAspect="1"/>
+            </wp:cNvGraphicFramePr>
+            <a:graphic>
+              <a:graphicData uri="http://schemas.openxmlformats.org/drawingml/2006/picture">
+                <pic:pic>
+                  <pic:nvPicPr>
+                    <pic:cNvPr id="0" name="Bai02_03b_DaThuc.png"/>
+                    <pic:cNvPicPr/>
+                  </pic:nvPicPr>
+                  <pic:blipFill>
+                    <a:blip r:embed="rId22"/>
+                    <a:stretch>
+                      <a:fillRect/>
+                    </a:stretch>
+                  </pic:blipFill>
+                  <pic:spPr>
+                    <a:xfrm>
+                      <a:off x="0" y="0"/>
+                      <a:ext cx="1614432" cy="3960000"/>
+                    </a:xfrm>
+                    <a:prstGeom prst="rect"/>
+                  </pic:spPr>
+                </pic:pic>
+              </a:graphicData>
+            </a:graphic>
+          </wp:inline>
+        </w:drawing>
+      </w:r>
+    </w:p>
+    <w:p>
+      <w:pPr>
+        <w:spacing w:after="120"/>
+        <w:jc w:val="center"/>
+      </w:pPr>
+      <w:r>
+        <w:rPr>
+          <w:i/>
+          <w:sz w:val="18"/>
+        </w:rPr>
+        <w:t>Sơ đồ lớp tham khảo dùng để đối chiếu cấu trúc và quan hệ giữa các lớp.</w:t>
+      </w:r>
+    </w:p>
+    <w:p>
+      <w:pPr>
+        <w:keepNext/>
+        <w:spacing w:before="140" w:after="80"/>
+      </w:pPr>
+      <w:r>
+        <w:rPr>
+          <w:b/>
+        </w:rPr>
+        <w:t>Giải thích bài làm</w:t>
+      </w:r>
+    </w:p>
+    <w:p>
+      <w:r>
+        <w:t>DaThuc bậc n chứa n cộng 1 đơn thức; phần tử thứ i luôn đại diện hệ số của x mũ i. Indexer trả bản sao DonThuc và khi gán sẽ giữ lại số mũ theo vị trí, nhờ đó cấu trúc đa thức không bị phá vỡ.</w:t>
+      </w:r>
+    </w:p>
+    <w:p>
+      <w:r>
+        <w:t>Giá trị đa thức được tính bằng sơ đồ Horner: duyệt hệ số từ bậc cao xuống thấp, mỗi bước lấy tổng hiện tại nhân x rồi cộng hệ số tiếp theo. Cách này tránh tính lặp lại các lũy thừa và cần ít phép nhân hơn cách cộng từng đơn thức.</w:t>
+      </w:r>
+    </w:p>
+    <w:p>
       <w:r>
         <w:rPr>
           <w:sz w:val="18"/>
@@ -6406,7 +7273,7 @@
         <w:rPr>
           <w:b/>
         </w:rPr>
-        <w:t>Yêu cầu và cách làm</w:t>
+        <w:t>Yêu cầu và hướng xử lý</w:t>
       </w:r>
     </w:p>
     <w:p>
@@ -6752,6 +7619,94 @@
       </w:pPr>
     </w:p>
     <w:p>
+      <w:pPr>
+        <w:keepNext/>
+        <w:pageBreakBefore/>
+        <w:spacing w:before="140" w:after="80"/>
+      </w:pPr>
+      <w:r>
+        <w:rPr>
+          <w:b/>
+        </w:rPr>
+        <w:t>Sơ đồ lớp</w:t>
+      </w:r>
+    </w:p>
+    <w:p>
+      <w:pPr>
+        <w:spacing w:after="60"/>
+        <w:jc w:val="center"/>
+      </w:pPr>
+      <w:r>
+        <w:drawing>
+          <wp:inline xmlns:a="http://schemas.openxmlformats.org/drawingml/2006/main" xmlns:pic="http://schemas.openxmlformats.org/drawingml/2006/picture">
+            <wp:extent cx="1383614" cy="3959999"/>
+            <wp:docPr id="12" name="Picture 12"/>
+            <wp:cNvGraphicFramePr>
+              <a:graphicFrameLocks noChangeAspect="1"/>
+            </wp:cNvGraphicFramePr>
+            <a:graphic>
+              <a:graphicData uri="http://schemas.openxmlformats.org/drawingml/2006/picture">
+                <pic:pic>
+                  <pic:nvPicPr>
+                    <pic:cNvPr id="0" name="Bai02_04b_DayPhanSo.png"/>
+                    <pic:cNvPicPr/>
+                  </pic:nvPicPr>
+                  <pic:blipFill>
+                    <a:blip r:embed="rId23"/>
+                    <a:stretch>
+                      <a:fillRect/>
+                    </a:stretch>
+                  </pic:blipFill>
+                  <pic:spPr>
+                    <a:xfrm>
+                      <a:off x="0" y="0"/>
+                      <a:ext cx="1383614" cy="3959999"/>
+                    </a:xfrm>
+                    <a:prstGeom prst="rect"/>
+                  </pic:spPr>
+                </pic:pic>
+              </a:graphicData>
+            </a:graphic>
+          </wp:inline>
+        </w:drawing>
+      </w:r>
+    </w:p>
+    <w:p>
+      <w:pPr>
+        <w:spacing w:after="120"/>
+        <w:jc w:val="center"/>
+      </w:pPr>
+      <w:r>
+        <w:rPr>
+          <w:i/>
+          <w:sz w:val="18"/>
+        </w:rPr>
+        <w:t>Sơ đồ lớp tham khảo dùng để đối chiếu cấu trúc và quan hệ giữa các lớp.</w:t>
+      </w:r>
+    </w:p>
+    <w:p>
+      <w:pPr>
+        <w:keepNext/>
+        <w:spacing w:before="140" w:after="80"/>
+      </w:pPr>
+      <w:r>
+        <w:rPr>
+          <w:b/>
+        </w:rPr>
+        <w:t>Giải thích bài làm</w:t>
+      </w:r>
+    </w:p>
+    <w:p>
+      <w:r>
+        <w:t>DayPhanSo chứa danh sách PhanSo và dùng indexer để truy cập từng vị trí. Mỗi phần tử được kiểm tra khác null; các phép cộng bên dưới kế thừa quy tắc rút gọn và chuẩn hóa dấu của lớp PhanSo.</w:t>
+      </w:r>
+    </w:p>
+    <w:p>
+      <w:r>
+        <w:t>Tong bắt đầu từ phân số 0 trên 1 rồi cộng tuần tự các phần tử. Vì toán tử cộng trả đối tượng mới, dữ liệu trong dãy không bị thay đổi; nếu danh sách rỗng thì kết quả tự nhiên vẫn là 0.</w:t>
+      </w:r>
+    </w:p>
+    <w:p>
       <w:r>
         <w:rPr>
           <w:sz w:val="18"/>
@@ -6778,7 +7733,7 @@
         <w:rPr>
           <w:b/>
         </w:rPr>
-        <w:t>Yêu cầu và cách làm</w:t>
+        <w:t>Yêu cầu và hướng xử lý</w:t>
       </w:r>
     </w:p>
     <w:p>
@@ -7180,6 +8135,94 @@
       </w:pPr>
     </w:p>
     <w:p>
+      <w:pPr>
+        <w:keepNext/>
+        <w:pageBreakBefore/>
+        <w:spacing w:before="140" w:after="80"/>
+      </w:pPr>
+      <w:r>
+        <w:rPr>
+          <w:b/>
+        </w:rPr>
+        <w:t>Sơ đồ lớp</w:t>
+      </w:r>
+    </w:p>
+    <w:p>
+      <w:pPr>
+        <w:spacing w:after="60"/>
+        <w:jc w:val="center"/>
+      </w:pPr>
+      <w:r>
+        <w:drawing>
+          <wp:inline xmlns:a="http://schemas.openxmlformats.org/drawingml/2006/main" xmlns:pic="http://schemas.openxmlformats.org/drawingml/2006/picture">
+            <wp:extent cx="2163829" cy="3960000"/>
+            <wp:docPr id="13" name="Picture 13"/>
+            <wp:cNvGraphicFramePr>
+              <a:graphicFrameLocks noChangeAspect="1"/>
+            </wp:cNvGraphicFramePr>
+            <a:graphic>
+              <a:graphicData uri="http://schemas.openxmlformats.org/drawingml/2006/picture">
+                <pic:pic>
+                  <pic:nvPicPr>
+                    <pic:cNvPr id="0" name="Bai02_05_LuongPhongBan.png"/>
+                    <pic:cNvPicPr/>
+                  </pic:nvPicPr>
+                  <pic:blipFill>
+                    <a:blip r:embed="rId24"/>
+                    <a:stretch>
+                      <a:fillRect/>
+                    </a:stretch>
+                  </pic:blipFill>
+                  <pic:spPr>
+                    <a:xfrm>
+                      <a:off x="0" y="0"/>
+                      <a:ext cx="2163829" cy="3960000"/>
+                    </a:xfrm>
+                    <a:prstGeom prst="rect"/>
+                  </pic:spPr>
+                </pic:pic>
+              </a:graphicData>
+            </a:graphic>
+          </wp:inline>
+        </w:drawing>
+      </w:r>
+    </w:p>
+    <w:p>
+      <w:pPr>
+        <w:spacing w:after="120"/>
+        <w:jc w:val="center"/>
+      </w:pPr>
+      <w:r>
+        <w:rPr>
+          <w:i/>
+          <w:sz w:val="18"/>
+        </w:rPr>
+        <w:t>Sơ đồ lớp tham khảo dùng để đối chiếu cấu trúc và quan hệ giữa các lớp.</w:t>
+      </w:r>
+    </w:p>
+    <w:p>
+      <w:pPr>
+        <w:keepNext/>
+        <w:spacing w:before="140" w:after="80"/>
+      </w:pPr>
+      <w:r>
+        <w:rPr>
+          <w:b/>
+        </w:rPr>
+        <w:t>Giải thích bài làm</w:t>
+      </w:r>
+    </w:p>
+    <w:p>
+      <w:r>
+        <w:t>NhanVienPhongBan lưu họ tên, mức lương và số ngày vắng; kiểu decimal được dùng cho tiền để tránh sai số nhị phân của double. TinhLuong áp dụng đúng công thức mức lương trừ 100.000 đồng cho mỗi ngày vắng.</w:t>
+      </w:r>
+    </w:p>
+    <w:p>
+      <w:r>
+        <w:t>PhongBan quản lý List&lt;NhanVienPhongBan&gt;, thực hiện nhập, xuất và cộng lương của từng nhân viên. Các phần kiểm tra đầu vào ngăn mức lương hoặc số ngày vắng âm, còn Program hiển thị chi tiết từng lương trước khi in tổng phòng ban.</w:t>
+      </w:r>
+    </w:p>
+    <w:p>
       <w:r>
         <w:rPr>
           <w:sz w:val="18"/>
@@ -7206,7 +8249,7 @@
         <w:rPr>
           <w:b/>
         </w:rPr>
-        <w:t>Yêu cầu và cách làm</w:t>
+        <w:t>Yêu cầu và hướng xử lý</w:t>
       </w:r>
     </w:p>
     <w:p>
@@ -7482,6 +8525,94 @@
       </w:pPr>
     </w:p>
     <w:p>
+      <w:pPr>
+        <w:keepNext/>
+        <w:pageBreakBefore/>
+        <w:spacing w:before="140" w:after="80"/>
+      </w:pPr>
+      <w:r>
+        <w:rPr>
+          <w:b/>
+        </w:rPr>
+        <w:t>Sơ đồ lớp</w:t>
+      </w:r>
+    </w:p>
+    <w:p>
+      <w:pPr>
+        <w:spacing w:after="60"/>
+        <w:jc w:val="center"/>
+      </w:pPr>
+      <w:r>
+        <w:drawing>
+          <wp:inline xmlns:a="http://schemas.openxmlformats.org/drawingml/2006/main" xmlns:pic="http://schemas.openxmlformats.org/drawingml/2006/picture">
+            <wp:extent cx="3628715" cy="3960000"/>
+            <wp:docPr id="14" name="Picture 14"/>
+            <wp:cNvGraphicFramePr>
+              <a:graphicFrameLocks noChangeAspect="1"/>
+            </wp:cNvGraphicFramePr>
+            <a:graphic>
+              <a:graphicData uri="http://schemas.openxmlformats.org/drawingml/2006/picture">
+                <pic:pic>
+                  <pic:nvPicPr>
+                    <pic:cNvPr id="0" name="Bai03_01_ArraySort.png"/>
+                    <pic:cNvPicPr/>
+                  </pic:nvPicPr>
+                  <pic:blipFill>
+                    <a:blip r:embed="rId25"/>
+                    <a:stretch>
+                      <a:fillRect/>
+                    </a:stretch>
+                  </pic:blipFill>
+                  <pic:spPr>
+                    <a:xfrm>
+                      <a:off x="0" y="0"/>
+                      <a:ext cx="3628715" cy="3960000"/>
+                    </a:xfrm>
+                    <a:prstGeom prst="rect"/>
+                  </pic:spPr>
+                </pic:pic>
+              </a:graphicData>
+            </a:graphic>
+          </wp:inline>
+        </w:drawing>
+      </w:r>
+    </w:p>
+    <w:p>
+      <w:pPr>
+        <w:spacing w:after="120"/>
+        <w:jc w:val="center"/>
+      </w:pPr>
+      <w:r>
+        <w:rPr>
+          <w:i/>
+          <w:sz w:val="18"/>
+        </w:rPr>
+        <w:t>Sơ đồ lớp tham khảo dùng để đối chiếu cấu trúc và quan hệ giữa các lớp.</w:t>
+      </w:r>
+    </w:p>
+    <w:p>
+      <w:pPr>
+        <w:keepNext/>
+        <w:spacing w:before="140" w:after="80"/>
+      </w:pPr>
+      <w:r>
+        <w:rPr>
+          <w:b/>
+        </w:rPr>
+        <w:t>Giải thích bài làm</w:t>
+      </w:r>
+    </w:p>
+    <w:p>
+      <w:r>
+        <w:t>SinhVien triển khai IComparable&lt;SinhVien&gt;, vì vậy Array.Sort có thể tự gọi CompareTo cho từng cặp phần tử. Khóa chính là điểm trung bình tăng dần; khi hai điểm bằng nhau, tên được dùng làm khóa phụ để kết quả ổn định và dễ kiểm tra.</w:t>
+      </w:r>
+    </w:p>
+    <w:p>
+      <w:r>
+        <w:t>Program nhập mảng đối tượng, gọi trực tiếp Array.Sort rồi in thứ tự sau sắp xếp. Bài này minh họa cách một lớp tự định nghĩa thứ tự tự nhiên của nó thông qua interface chuẩn của .NET.</w:t>
+      </w:r>
+    </w:p>
+    <w:p>
       <w:r>
         <w:rPr>
           <w:sz w:val="18"/>
@@ -7508,7 +8639,7 @@
         <w:rPr>
           <w:b/>
         </w:rPr>
-        <w:t>Yêu cầu và cách làm</w:t>
+        <w:t>Yêu cầu và hướng xử lý</w:t>
       </w:r>
     </w:p>
     <w:p>
@@ -7868,6 +8999,94 @@
       </w:pPr>
     </w:p>
     <w:p>
+      <w:pPr>
+        <w:keepNext/>
+        <w:pageBreakBefore/>
+        <w:spacing w:before="140" w:after="80"/>
+      </w:pPr>
+      <w:r>
+        <w:rPr>
+          <w:b/>
+        </w:rPr>
+        <w:t>Sơ đồ lớp</w:t>
+      </w:r>
+    </w:p>
+    <w:p>
+      <w:pPr>
+        <w:spacing w:after="60"/>
+        <w:jc w:val="center"/>
+      </w:pPr>
+      <w:r>
+        <w:drawing>
+          <wp:inline xmlns:a="http://schemas.openxmlformats.org/drawingml/2006/main" xmlns:pic="http://schemas.openxmlformats.org/drawingml/2006/picture">
+            <wp:extent cx="5040000" cy="3500307"/>
+            <wp:docPr id="15" name="Picture 15"/>
+            <wp:cNvGraphicFramePr>
+              <a:graphicFrameLocks noChangeAspect="1"/>
+            </wp:cNvGraphicFramePr>
+            <a:graphic>
+              <a:graphicData uri="http://schemas.openxmlformats.org/drawingml/2006/picture">
+                <pic:pic>
+                  <pic:nvPicPr>
+                    <pic:cNvPr id="0" name="Bai03_02_InterfaceSort.png"/>
+                    <pic:cNvPicPr/>
+                  </pic:nvPicPr>
+                  <pic:blipFill>
+                    <a:blip r:embed="rId26"/>
+                    <a:stretch>
+                      <a:fillRect/>
+                    </a:stretch>
+                  </pic:blipFill>
+                  <pic:spPr>
+                    <a:xfrm>
+                      <a:off x="0" y="0"/>
+                      <a:ext cx="5040000" cy="3500307"/>
+                    </a:xfrm>
+                    <a:prstGeom prst="rect"/>
+                  </pic:spPr>
+                </pic:pic>
+              </a:graphicData>
+            </a:graphic>
+          </wp:inline>
+        </w:drawing>
+      </w:r>
+    </w:p>
+    <w:p>
+      <w:pPr>
+        <w:spacing w:after="120"/>
+        <w:jc w:val="center"/>
+      </w:pPr>
+      <w:r>
+        <w:rPr>
+          <w:i/>
+          <w:sz w:val="18"/>
+        </w:rPr>
+        <w:t>Sơ đồ lớp tham khảo dùng để đối chiếu cấu trúc và quan hệ giữa các lớp.</w:t>
+      </w:r>
+    </w:p>
+    <w:p>
+      <w:pPr>
+        <w:keepNext/>
+        <w:spacing w:before="140" w:after="80"/>
+      </w:pPr>
+      <w:r>
+        <w:rPr>
+          <w:b/>
+        </w:rPr>
+        <w:t>Giải thích bài làm</w:t>
+      </w:r>
+    </w:p>
+    <w:p>
+      <w:r>
+        <w:t>Phương thức SapXep&lt;T&gt; đặt ràng buộc T phải triển khai IComparable&lt;T&gt;, nhờ đó thuật toán có thể gọi CompareTo mà không biết kiểu cụ thể. Cùng một mã sắp xếp dùng được cho số nguyên và cho lớp SinhVien.</w:t>
+      </w:r>
+    </w:p>
+    <w:p>
+      <w:r>
+        <w:t>Thuật toán insertion sort lấy từng phần tử làm khóa rồi dịch các phần tử lớn hơn sang phải. Điều kiện chỉ dịch khi CompareTo lớn hơn 0 giúp giữ thứ tự tương đối của các phần tử bằng nhau, tạo tính ổn định cho kết quả.</w:t>
+      </w:r>
+    </w:p>
+    <w:p>
       <w:r>
         <w:rPr>
           <w:sz w:val="18"/>
@@ -7894,7 +9113,7 @@
         <w:rPr>
           <w:b/>
         </w:rPr>
-        <w:t>Yêu cầu và cách làm</w:t>
+        <w:t>Yêu cầu và hướng xử lý</w:t>
       </w:r>
     </w:p>
     <w:p>
@@ -8310,6 +9529,94 @@
       </w:pPr>
     </w:p>
     <w:p>
+      <w:pPr>
+        <w:keepNext/>
+        <w:pageBreakBefore/>
+        <w:spacing w:before="140" w:after="80"/>
+      </w:pPr>
+      <w:r>
+        <w:rPr>
+          <w:b/>
+        </w:rPr>
+        <w:t>Sơ đồ lớp</w:t>
+      </w:r>
+    </w:p>
+    <w:p>
+      <w:pPr>
+        <w:spacing w:after="60"/>
+        <w:jc w:val="center"/>
+      </w:pPr>
+      <w:r>
+        <w:drawing>
+          <wp:inline xmlns:a="http://schemas.openxmlformats.org/drawingml/2006/main" xmlns:pic="http://schemas.openxmlformats.org/drawingml/2006/picture">
+            <wp:extent cx="4950000" cy="3960000"/>
+            <wp:docPr id="16" name="Picture 16"/>
+            <wp:cNvGraphicFramePr>
+              <a:graphicFrameLocks noChangeAspect="1"/>
+            </wp:cNvGraphicFramePr>
+            <a:graphic>
+              <a:graphicData uri="http://schemas.openxmlformats.org/drawingml/2006/picture">
+                <pic:pic>
+                  <pic:nvPicPr>
+                    <pic:cNvPr id="0" name="Bai03_03_DelegateSort.png"/>
+                    <pic:cNvPicPr/>
+                  </pic:nvPicPr>
+                  <pic:blipFill>
+                    <a:blip r:embed="rId27"/>
+                    <a:stretch>
+                      <a:fillRect/>
+                    </a:stretch>
+                  </pic:blipFill>
+                  <pic:spPr>
+                    <a:xfrm>
+                      <a:off x="0" y="0"/>
+                      <a:ext cx="4950000" cy="3960000"/>
+                    </a:xfrm>
+                    <a:prstGeom prst="rect"/>
+                  </pic:spPr>
+                </pic:pic>
+              </a:graphicData>
+            </a:graphic>
+          </wp:inline>
+        </w:drawing>
+      </w:r>
+    </w:p>
+    <w:p>
+      <w:pPr>
+        <w:spacing w:after="120"/>
+        <w:jc w:val="center"/>
+      </w:pPr>
+      <w:r>
+        <w:rPr>
+          <w:i/>
+          <w:sz w:val="18"/>
+        </w:rPr>
+        <w:t>Sơ đồ lớp tham khảo dùng để đối chiếu cấu trúc và quan hệ giữa các lớp.</w:t>
+      </w:r>
+    </w:p>
+    <w:p>
+      <w:pPr>
+        <w:keepNext/>
+        <w:spacing w:before="140" w:after="80"/>
+      </w:pPr>
+      <w:r>
+        <w:rPr>
+          <w:b/>
+        </w:rPr>
+        <w:t>Giải thích bài làm</w:t>
+      </w:r>
+    </w:p>
+    <w:p>
+      <w:r>
+        <w:t>Phiên bản delegate nhận Comparison&lt;T&gt; từ bên ngoài thay vì yêu cầu T có thứ tự cố định. Thuật toán chỉ gọi hàm so sánh được truyền vào, vì vậy cùng một mảng có thể sắp theo nhiều tiêu chí mà không sửa lớp dữ liệu.</w:t>
+      </w:r>
+    </w:p>
+    <w:p>
+      <w:r>
+        <w:t>Chương trình minh họa sắp sinh viên theo điểm giảm dần và dùng tên tăng dần khi bằng điểm. Việc tách quy tắc so sánh khỏi thuật toán làm mã linh hoạt hơn và thể hiện cách truyền hành vi bằng delegate trong C Sharp.</w:t>
+      </w:r>
+    </w:p>
+    <w:p>
       <w:r>
         <w:rPr>
           <w:sz w:val="18"/>
@@ -8336,7 +9643,7 @@
         <w:rPr>
           <w:b/>
         </w:rPr>
-        <w:t>Yêu cầu và cách làm</w:t>
+        <w:t>Yêu cầu và hướng xử lý</w:t>
       </w:r>
     </w:p>
     <w:p>
@@ -8850,6 +10157,94 @@
       </w:pPr>
     </w:p>
     <w:p>
+      <w:pPr>
+        <w:keepNext/>
+        <w:pageBreakBefore/>
+        <w:spacing w:before="140" w:after="80"/>
+      </w:pPr>
+      <w:r>
+        <w:rPr>
+          <w:b/>
+        </w:rPr>
+        <w:t>Sơ đồ lớp</w:t>
+      </w:r>
+    </w:p>
+    <w:p>
+      <w:pPr>
+        <w:spacing w:after="60"/>
+        <w:jc w:val="center"/>
+      </w:pPr>
+      <w:r>
+        <w:drawing>
+          <wp:inline xmlns:a="http://schemas.openxmlformats.org/drawingml/2006/main" xmlns:pic="http://schemas.openxmlformats.org/drawingml/2006/picture">
+            <wp:extent cx="3088579" cy="3960000"/>
+            <wp:docPr id="17" name="Picture 17"/>
+            <wp:cNvGraphicFramePr>
+              <a:graphicFrameLocks noChangeAspect="1"/>
+            </wp:cNvGraphicFramePr>
+            <a:graphic>
+              <a:graphicData uri="http://schemas.openxmlformats.org/drawingml/2006/picture">
+                <pic:pic>
+                  <pic:nvPicPr>
+                    <pic:cNvPr id="0" name="Bai03_04_ConsoleMenu.png"/>
+                    <pic:cNvPicPr/>
+                  </pic:nvPicPr>
+                  <pic:blipFill>
+                    <a:blip r:embed="rId28"/>
+                    <a:stretch>
+                      <a:fillRect/>
+                    </a:stretch>
+                  </pic:blipFill>
+                  <pic:spPr>
+                    <a:xfrm>
+                      <a:off x="0" y="0"/>
+                      <a:ext cx="3088579" cy="3960000"/>
+                    </a:xfrm>
+                    <a:prstGeom prst="rect"/>
+                  </pic:spPr>
+                </pic:pic>
+              </a:graphicData>
+            </a:graphic>
+          </wp:inline>
+        </w:drawing>
+      </w:r>
+    </w:p>
+    <w:p>
+      <w:pPr>
+        <w:spacing w:after="120"/>
+        <w:jc w:val="center"/>
+      </w:pPr>
+      <w:r>
+        <w:rPr>
+          <w:i/>
+          <w:sz w:val="18"/>
+        </w:rPr>
+        <w:t>Sơ đồ lớp tham khảo dùng để đối chiếu cấu trúc và quan hệ giữa các lớp.</w:t>
+      </w:r>
+    </w:p>
+    <w:p>
+      <w:pPr>
+        <w:keepNext/>
+        <w:spacing w:before="140" w:after="80"/>
+      </w:pPr>
+      <w:r>
+        <w:rPr>
+          <w:b/>
+        </w:rPr>
+        <w:t>Giải thích bài làm</w:t>
+      </w:r>
+    </w:p>
+    <w:p>
+      <w:r>
+        <w:t>ConsoleMenu quản lý danh sách chức năng, hiển thị lựa chọn và phát sự kiện Choose khi người dùng chọn hợp lệ. Select kiểm tra khóa tồn tại trước khi Execute và Invoke sự kiện, do đó lựa chọn sai không làm chương trình dừng đột ngột.</w:t>
+      </w:r>
+    </w:p>
+    <w:p>
+      <w:r>
+        <w:t>PTBac2Console kế thừa ConsoleMenu và override Execute để cài hai chức năng: giải phương trình qua MyLib và xem hướng dẫn. Program còn đăng ký một hàm lắng nghe Choose, chứng minh lớp bên ngoài có thể phản ứng với lựa chọn mà không sửa mã của menu.</w:t>
+      </w:r>
+    </w:p>
+    <w:p>
       <w:r>
         <w:rPr>
           <w:sz w:val="18"/>
@@ -8876,7 +10271,7 @@
         <w:rPr>
           <w:b/>
         </w:rPr>
-        <w:t>Yêu cầu và cách làm</w:t>
+        <w:t>Yêu cầu và hướng xử lý</w:t>
       </w:r>
     </w:p>
     <w:p>
@@ -9208,6 +10603,94 @@
       </w:pPr>
     </w:p>
     <w:p>
+      <w:pPr>
+        <w:keepNext/>
+        <w:pageBreakBefore/>
+        <w:spacing w:before="140" w:after="80"/>
+      </w:pPr>
+      <w:r>
+        <w:rPr>
+          <w:b/>
+        </w:rPr>
+        <w:t>Sơ đồ lớp</w:t>
+      </w:r>
+    </w:p>
+    <w:p>
+      <w:pPr>
+        <w:spacing w:after="60"/>
+        <w:jc w:val="center"/>
+      </w:pPr>
+      <w:r>
+        <w:drawing>
+          <wp:inline xmlns:a="http://schemas.openxmlformats.org/drawingml/2006/main" xmlns:pic="http://schemas.openxmlformats.org/drawingml/2006/picture">
+            <wp:extent cx="4460124" cy="3960000"/>
+            <wp:docPr id="18" name="Picture 18"/>
+            <wp:cNvGraphicFramePr>
+              <a:graphicFrameLocks noChangeAspect="1"/>
+            </wp:cNvGraphicFramePr>
+            <a:graphic>
+              <a:graphicData uri="http://schemas.openxmlformats.org/drawingml/2006/picture">
+                <pic:pic>
+                  <pic:nvPicPr>
+                    <pic:cNvPr id="0" name="Bai03_05_LuongKeThua.png"/>
+                    <pic:cNvPicPr/>
+                  </pic:nvPicPr>
+                  <pic:blipFill>
+                    <a:blip r:embed="rId29"/>
+                    <a:stretch>
+                      <a:fillRect/>
+                    </a:stretch>
+                  </pic:blipFill>
+                  <pic:spPr>
+                    <a:xfrm>
+                      <a:off x="0" y="0"/>
+                      <a:ext cx="4460124" cy="3960000"/>
+                    </a:xfrm>
+                    <a:prstGeom prst="rect"/>
+                  </pic:spPr>
+                </pic:pic>
+              </a:graphicData>
+            </a:graphic>
+          </wp:inline>
+        </w:drawing>
+      </w:r>
+    </w:p>
+    <w:p>
+      <w:pPr>
+        <w:spacing w:after="120"/>
+        <w:jc w:val="center"/>
+      </w:pPr>
+      <w:r>
+        <w:rPr>
+          <w:i/>
+          <w:sz w:val="18"/>
+        </w:rPr>
+        <w:t>Sơ đồ lớp tham khảo dùng để đối chiếu cấu trúc và quan hệ giữa các lớp.</w:t>
+      </w:r>
+    </w:p>
+    <w:p>
+      <w:pPr>
+        <w:keepNext/>
+        <w:spacing w:before="140" w:after="80"/>
+      </w:pPr>
+      <w:r>
+        <w:rPr>
+          <w:b/>
+        </w:rPr>
+        <w:t>Giải thích bài làm</w:t>
+      </w:r>
+    </w:p>
+    <w:p>
+      <w:r>
+        <w:t>NhanVien là lớp trừu tượng chứa thông tin chung và khai báo TinhLuong trừu tượng. NhanVienKinhDoanh tính lương cơ bản cộng 500.000 đồng cho mỗi hợp đồng; NhanVienSanXuat tính 1.000 đồng mỗi sản phẩm và cộng 5 phần trăm khi sản lượng lớn hơn 3.000.</w:t>
+      </w:r>
+    </w:p>
+    <w:p>
+      <w:r>
+        <w:t>Danh sách được khai báo theo kiểu NhanVien nhưng chứa đối tượng của hai lớp con. Khi gọi TinhLuong hoặc Output, cơ chế đa hình chọn đúng phiên bản override theo loại thực tế; tổng lương vì vậy được tính đúng mà không cần chuỗi if theo từng loại nhân viên.</w:t>
+      </w:r>
+    </w:p>
+    <w:p>
       <w:r>
         <w:rPr>
           <w:sz w:val="18"/>
@@ -9234,7 +10717,7 @@
         <w:rPr>
           <w:b/>
         </w:rPr>
-        <w:t>Yêu cầu và cách làm</w:t>
+        <w:t>Yêu cầu và hướng xử lý</w:t>
       </w:r>
     </w:p>
     <w:p>
@@ -9706,6 +11189,94 @@
       </w:pPr>
     </w:p>
     <w:p>
+      <w:pPr>
+        <w:keepNext/>
+        <w:pageBreakBefore/>
+        <w:spacing w:before="140" w:after="80"/>
+      </w:pPr>
+      <w:r>
+        <w:rPr>
+          <w:b/>
+        </w:rPr>
+        <w:t>Sơ đồ lớp</w:t>
+      </w:r>
+    </w:p>
+    <w:p>
+      <w:pPr>
+        <w:spacing w:after="60"/>
+        <w:jc w:val="center"/>
+      </w:pPr>
+      <w:r>
+        <w:drawing>
+          <wp:inline xmlns:a="http://schemas.openxmlformats.org/drawingml/2006/main" xmlns:pic="http://schemas.openxmlformats.org/drawingml/2006/picture">
+            <wp:extent cx="3542830" cy="3960000"/>
+            <wp:docPr id="19" name="Picture 19"/>
+            <wp:cNvGraphicFramePr>
+              <a:graphicFrameLocks noChangeAspect="1"/>
+            </wp:cNvGraphicFramePr>
+            <a:graphic>
+              <a:graphicData uri="http://schemas.openxmlformats.org/drawingml/2006/picture">
+                <pic:pic>
+                  <pic:nvPicPr>
+                    <pic:cNvPr id="0" name="Bai03_06_ThiSinh.png"/>
+                    <pic:cNvPicPr/>
+                  </pic:nvPicPr>
+                  <pic:blipFill>
+                    <a:blip r:embed="rId30"/>
+                    <a:stretch>
+                      <a:fillRect/>
+                    </a:stretch>
+                  </pic:blipFill>
+                  <pic:spPr>
+                    <a:xfrm>
+                      <a:off x="0" y="0"/>
+                      <a:ext cx="3542830" cy="3960000"/>
+                    </a:xfrm>
+                    <a:prstGeom prst="rect"/>
+                  </pic:spPr>
+                </pic:pic>
+              </a:graphicData>
+            </a:graphic>
+          </wp:inline>
+        </w:drawing>
+      </w:r>
+    </w:p>
+    <w:p>
+      <w:pPr>
+        <w:spacing w:after="120"/>
+        <w:jc w:val="center"/>
+      </w:pPr>
+      <w:r>
+        <w:rPr>
+          <w:i/>
+          <w:sz w:val="18"/>
+        </w:rPr>
+        <w:t>Sơ đồ lớp tham khảo dùng để đối chiếu cấu trúc và quan hệ giữa các lớp.</w:t>
+      </w:r>
+    </w:p>
+    <w:p>
+      <w:pPr>
+        <w:keepNext/>
+        <w:spacing w:before="140" w:after="80"/>
+      </w:pPr>
+      <w:r>
+        <w:rPr>
+          <w:b/>
+        </w:rPr>
+        <w:t>Giải thích bài làm</w:t>
+      </w:r>
+    </w:p>
+    <w:p>
+      <w:r>
+        <w:t>ThiSinh là lớp cơ sở trừu tượng chứa số báo danh, họ tên và điểm ba bài chung. Chuyen bổ sung điểm tiếng Anh và quy tắc thưởng; SieuCup bổ sung điểm cơ sở dữ liệu. Mọi điểm đều được kiểm tra nằm trong khoảng từ 0 đến 10.</w:t>
+      </w:r>
+    </w:p>
+    <w:p>
+      <w:r>
+        <w:t>TongDiem được override ở từng lớp con và được gọi đa hình qua danh sách ThiSinh. Với thí sinh Chuyên, tiếng Anh trong khoảng đóng từ 7 đến 8 được cộng 1 điểm, từ 9 đến 10 được cộng 2 điểm; giá trị 8,5 không thuộc hai khoảng nên không được cộng theo đúng đề.</w:t>
+      </w:r>
+    </w:p>
+    <w:p>
       <w:r>
         <w:rPr>
           <w:sz w:val="18"/>
@@ -9784,11 +11355,16 @@
         <w:t>2. NNLTCS - Thuc Hanh 02 - Lap trinh huong doi tuong CSharp.pdf, DNTAI 2024.</w:t>
       </w:r>
     </w:p>
+    <w:p>
+      <w:r>
+        <w:t>3. Sơ đồ lớp tham khảo từ file LAB2_BAOCAOMONHOCCSHARP.docx.</w:t>
+      </w:r>
+    </w:p>
     <w:sectPr>
-      <w:headerReference w:type="default" r:id="rId10"/>
-      <w:footerReference w:type="default" r:id="rId11"/>
+      <w:headerReference w:type="default" r:id="rId11"/>
+      <w:footerReference w:type="default" r:id="rId12"/>
       <w:pgSz w:w="11906" w:h="16838"/>
-      <w:pgMar w:top="1020" w:right="1134" w:bottom="1020" w:left="1247" w:header="720" w:footer="720" w:gutter="0"/>
+      <w:pgMar w:top="1020" w:right="1134" w:bottom="1020" w:left="1247" w:header="720" w:footer="397" w:gutter="0"/>
       <w:cols w:space="720"/>
       <w:docGrid w:linePitch="360"/>
       <w:pgBorders w:offsetFrom="page">
@@ -9804,6 +11380,25 @@
 </file>
 
 <file path=word/footer1.xml><?xml version="1.0" encoding="utf-8"?>
+<w:ftr xmlns:m="http://schemas.openxmlformats.org/officeDocument/2006/math" xmlns:mc="http://schemas.openxmlformats.org/markup-compatibility/2006" xmlns:mo="http://schemas.microsoft.com/office/mac/office/2008/main" xmlns:mv="urn:schemas-microsoft-com:mac:vml" xmlns:o="urn:schemas-microsoft-com:office:office" xmlns:r="http://schemas.openxmlformats.org/officeDocument/2006/relationships" xmlns:v="urn:schemas-microsoft-com:vml" xmlns:w10="urn:schemas-microsoft-com:office:word" xmlns:w14="http://schemas.microsoft.com/office/word/2010/wordml" xmlns:w="http://schemas.openxmlformats.org/wordprocessingml/2006/main" xmlns:wne="http://schemas.microsoft.com/office/word/2006/wordml" xmlns:wp14="http://schemas.microsoft.com/office/word/2010/wordprocessingDrawing" xmlns:wp="http://schemas.openxmlformats.org/drawingml/2006/wordprocessingDrawing" xmlns:wpc="http://schemas.microsoft.com/office/word/2010/wordprocessingCanvas" xmlns:wpg="http://schemas.microsoft.com/office/word/2010/wordprocessingGroup" xmlns:wpi="http://schemas.microsoft.com/office/word/2010/wordprocessingInk" xmlns:wps="http://schemas.microsoft.com/office/word/2010/wordprocessingShape" mc:Ignorable="w14 wp14">
+  <w:p>
+    <w:pPr>
+      <w:pStyle w:val="Footer"/>
+      <w:jc w:val="center"/>
+    </w:pPr>
+    <w:r>
+      <w:rPr>
+        <w:rFonts w:ascii="Times New Roman" w:hAnsi="Times New Roman" w:eastAsia="Times New Roman"/>
+        <w:color w:val="000000"/>
+        <w:sz w:val="24"/>
+      </w:rPr>
+      <w:t>Thành phố Hồ Chí Minh, năm 2026</w:t>
+    </w:r>
+  </w:p>
+</w:ftr>
+</file>
+
+<file path=word/footer2.xml><?xml version="1.0" encoding="utf-8"?>
 <w:ftr xmlns:m="http://schemas.openxmlformats.org/officeDocument/2006/math" xmlns:mc="http://schemas.openxmlformats.org/markup-compatibility/2006" xmlns:mo="http://schemas.microsoft.com/office/mac/office/2008/main" xmlns:mv="urn:schemas-microsoft-com:mac:vml" xmlns:o="urn:schemas-microsoft-com:office:office" xmlns:r="http://schemas.openxmlformats.org/officeDocument/2006/relationships" xmlns:v="urn:schemas-microsoft-com:vml" xmlns:w10="urn:schemas-microsoft-com:office:word" xmlns:w14="http://schemas.microsoft.com/office/word/2010/wordml" xmlns:w="http://schemas.openxmlformats.org/wordprocessingml/2006/main" xmlns:wne="http://schemas.microsoft.com/office/word/2006/wordml" xmlns:wp14="http://schemas.microsoft.com/office/word/2010/wordprocessingDrawing" xmlns:wp="http://schemas.openxmlformats.org/drawingml/2006/wordprocessingDrawing" xmlns:wpc="http://schemas.microsoft.com/office/word/2010/wordprocessingCanvas" xmlns:wpg="http://schemas.microsoft.com/office/word/2010/wordprocessingGroup" xmlns:wpi="http://schemas.microsoft.com/office/word/2010/wordprocessingInk" xmlns:wps="http://schemas.microsoft.com/office/word/2010/wordprocessingShape" mc:Ignorable="w14 wp14">
   <w:p>
     <w:pPr>

</xml_diff>